<commit_message>
Fixed account information page
Fixed orders, loyalty and address pages. and added producers images
</commit_message>
<xml_diff>
--- a/Task 2/Task 2 Development Template.docx
+++ b/Task 2/Task 2 Development Template.docx
@@ -1,6 +1,6 @@
 
 <file path=word/document.xml><?xml version="1.0" encoding="utf-8"?>
-<w:document xmlns:wpc="http://schemas.microsoft.com/office/word/2010/wordprocessingCanvas" xmlns:cx="http://schemas.microsoft.com/office/drawing/2014/chartex" xmlns:cx1="http://schemas.microsoft.com/office/drawing/2015/9/8/chartex" xmlns:cx2="http://schemas.microsoft.com/office/drawing/2015/10/21/chartex" xmlns:cx3="http://schemas.microsoft.com/office/drawing/2016/5/9/chartex" xmlns:cx4="http://schemas.microsoft.com/office/drawing/2016/5/10/chartex" xmlns:cx5="http://schemas.microsoft.com/office/drawing/2016/5/11/chartex" xmlns:cx6="http://schemas.microsoft.com/office/drawing/2016/5/12/chartex" xmlns:cx7="http://schemas.microsoft.com/office/drawing/2016/5/13/chartex" xmlns:cx8="http://schemas.microsoft.com/office/drawing/2016/5/14/chartex" xmlns:mc="http://schemas.openxmlformats.org/markup-compatibility/2006" xmlns:aink="http://schemas.microsoft.com/office/drawing/2016/ink" xmlns:am3d="http://schemas.microsoft.com/office/drawing/2017/model3d" xmlns:o="urn:schemas-microsoft-com:office:office" xmlns:r="http://schemas.openxmlformats.org/officeDocument/2006/relationships" xmlns:m="http://schemas.openxmlformats.org/officeDocument/2006/math" xmlns:v="urn:schemas-microsoft-com:vml" xmlns:wp14="http://schemas.microsoft.com/office/word/2010/wordprocessingDrawing" xmlns:wp="http://schemas.openxmlformats.org/drawingml/2006/wordprocessingDrawing" xmlns:w10="urn:schemas-microsoft-com:office:word" xmlns:w="http://schemas.openxmlformats.org/wordprocessingml/2006/main" xmlns:w14="http://schemas.microsoft.com/office/word/2010/wordml" xmlns:w15="http://schemas.microsoft.com/office/word/2012/wordml" xmlns:w16cex="http://schemas.microsoft.com/office/word/2018/wordml/cex" xmlns:w16cid="http://schemas.microsoft.com/office/word/2016/wordml/cid" xmlns:w16="http://schemas.microsoft.com/office/word/2018/wordml" xmlns:w16sdtdh="http://schemas.microsoft.com/office/word/2020/wordml/sdtdatahash" xmlns:w16se="http://schemas.microsoft.com/office/word/2015/wordml/symex" xmlns:wpg="http://schemas.microsoft.com/office/word/2010/wordprocessingGroup" xmlns:wpi="http://schemas.microsoft.com/office/word/2010/wordprocessingInk" xmlns:wne="http://schemas.microsoft.com/office/word/2006/wordml" xmlns:wps="http://schemas.microsoft.com/office/word/2010/wordprocessingShape" mc:Ignorable="w14 w15 w16se w16cid w16 w16cex w16sdtdh wp14">
+<w:document xmlns:wpc="http://schemas.microsoft.com/office/word/2010/wordprocessingCanvas" xmlns:cx="http://schemas.microsoft.com/office/drawing/2014/chartex" xmlns:cx1="http://schemas.microsoft.com/office/drawing/2015/9/8/chartex" xmlns:cx2="http://schemas.microsoft.com/office/drawing/2015/10/21/chartex" xmlns:cx3="http://schemas.microsoft.com/office/drawing/2016/5/9/chartex" xmlns:cx4="http://schemas.microsoft.com/office/drawing/2016/5/10/chartex" xmlns:cx5="http://schemas.microsoft.com/office/drawing/2016/5/11/chartex" xmlns:cx6="http://schemas.microsoft.com/office/drawing/2016/5/12/chartex" xmlns:cx7="http://schemas.microsoft.com/office/drawing/2016/5/13/chartex" xmlns:cx8="http://schemas.microsoft.com/office/drawing/2016/5/14/chartex" xmlns:mc="http://schemas.openxmlformats.org/markup-compatibility/2006" xmlns:aink="http://schemas.microsoft.com/office/drawing/2016/ink" xmlns:am3d="http://schemas.microsoft.com/office/drawing/2017/model3d" xmlns:o="urn:schemas-microsoft-com:office:office" xmlns:oel="http://schemas.microsoft.com/office/2019/extlst" xmlns:r="http://schemas.openxmlformats.org/officeDocument/2006/relationships" xmlns:m="http://schemas.openxmlformats.org/officeDocument/2006/math" xmlns:v="urn:schemas-microsoft-com:vml" xmlns:wp14="http://schemas.microsoft.com/office/word/2010/wordprocessingDrawing" xmlns:wp="http://schemas.openxmlformats.org/drawingml/2006/wordprocessingDrawing" xmlns:w10="urn:schemas-microsoft-com:office:word" xmlns:w="http://schemas.openxmlformats.org/wordprocessingml/2006/main" xmlns:w14="http://schemas.microsoft.com/office/word/2010/wordml" xmlns:w15="http://schemas.microsoft.com/office/word/2012/wordml" xmlns:w16cex="http://schemas.microsoft.com/office/word/2018/wordml/cex" xmlns:w16cid="http://schemas.microsoft.com/office/word/2016/wordml/cid" xmlns:w16="http://schemas.microsoft.com/office/word/2018/wordml" xmlns:w16du="http://schemas.microsoft.com/office/word/2023/wordml/word16du" xmlns:w16sdtdh="http://schemas.microsoft.com/office/word/2020/wordml/sdtdatahash" xmlns:w16sdtfl="http://schemas.microsoft.com/office/word/2024/wordml/sdtformatlock" xmlns:w16se="http://schemas.microsoft.com/office/word/2015/wordml/symex" xmlns:wpg="http://schemas.microsoft.com/office/word/2010/wordprocessingGroup" xmlns:wpi="http://schemas.microsoft.com/office/word/2010/wordprocessingInk" xmlns:wne="http://schemas.microsoft.com/office/word/2006/wordml" xmlns:wps="http://schemas.microsoft.com/office/word/2010/wordprocessingShape" mc:Ignorable="w14 w15 w16se w16cid w16 w16cex w16sdtdh w16sdtfl w16du wp14">
   <w:body>
     <w:p>
       <w:pPr>
@@ -357,6 +357,9 @@
     <w:p/>
     <w:p>
       <w:r>
+        <w:rPr>
+          <w:noProof/>
+        </w:rPr>
         <w:drawing>
           <wp:inline distT="0" distB="0" distL="0" distR="0" wp14:anchorId="0E4BD627" wp14:editId="2E58D72B">
             <wp:extent cx="3857625" cy="2282789"/>
@@ -401,6 +404,9 @@
         </w:drawing>
       </w:r>
       <w:r>
+        <w:rPr>
+          <w:noProof/>
+        </w:rPr>
         <w:drawing>
           <wp:inline distT="0" distB="0" distL="0" distR="0" wp14:anchorId="09AE5194" wp14:editId="455A81AB">
             <wp:extent cx="5943600" cy="750570"/>
@@ -447,31 +453,7 @@
         </w:numPr>
       </w:pPr>
       <w:r>
-        <w:t xml:space="preserve">Instead of using return </w:t>
-      </w:r>
-      <w:proofErr w:type="spellStart"/>
-      <w:r>
-        <w:t>NotFound</w:t>
-      </w:r>
-      <w:proofErr w:type="spellEnd"/>
-      <w:r>
-        <w:t xml:space="preserve"> in the </w:t>
-      </w:r>
-      <w:proofErr w:type="spellStart"/>
-      <w:r>
-        <w:t>shoppingCartsItemsController</w:t>
-      </w:r>
-      <w:proofErr w:type="spellEnd"/>
-      <w:r>
-        <w:t xml:space="preserve">, I used the </w:t>
-      </w:r>
-      <w:proofErr w:type="spellStart"/>
-      <w:r>
-        <w:t>RedirectToPage</w:t>
-      </w:r>
-      <w:proofErr w:type="spellEnd"/>
-      <w:r>
-        <w:t xml:space="preserve"> method for a better user experience.</w:t>
+        <w:t>Instead of using return NotFound in the shoppingCartsItemsController, I used the RedirectToPage method for a better user experience.</w:t>
       </w:r>
     </w:p>
     <w:p/>
@@ -493,13 +475,7 @@
         <w:rPr>
           <w:color w:val="FF0000"/>
         </w:rPr>
-        <w:t xml:space="preserve"> </w:t>
-      </w:r>
-      <w:r>
-        <w:rPr>
-          <w:color w:val="FF0000"/>
-        </w:rPr>
-        <w:t>[Get a Screenshot]</w:t>
+        <w:t xml:space="preserve"> [Get a Screenshot]</w:t>
       </w:r>
     </w:p>
     <w:p/>
@@ -515,27 +491,11 @@
         <w:t xml:space="preserve">Now Filtering for the user works amazingly, but a problem occurred for </w:t>
       </w:r>
       <w:r>
-        <w:t xml:space="preserve">a logged in producer. The products page displays only the logged in </w:t>
-      </w:r>
-      <w:proofErr w:type="gramStart"/>
-      <w:r>
-        <w:t>producers</w:t>
-      </w:r>
-      <w:proofErr w:type="gramEnd"/>
-      <w:r>
-        <w:t xml:space="preserve"> products which is fine, until they decide </w:t>
+        <w:t xml:space="preserve">a logged in producer. The products page displays only the logged in producers products which is fine, until they decide </w:t>
       </w:r>
       <w:r>
         <w:lastRenderedPageBreak/>
-        <w:t xml:space="preserve">to filter the products. That’s when other </w:t>
-      </w:r>
-      <w:proofErr w:type="gramStart"/>
-      <w:r>
-        <w:t>producers</w:t>
-      </w:r>
-      <w:proofErr w:type="gramEnd"/>
-      <w:r>
-        <w:t xml:space="preserve"> products shows after filtering, so I added role-based filtering as well to fix the issue. </w:t>
+        <w:t xml:space="preserve">to filter the products. That’s when other producers products shows after filtering, so I added role-based filtering as well to fix the issue. </w:t>
       </w:r>
       <w:r>
         <w:rPr>
@@ -564,6 +524,9 @@
         <w:t xml:space="preserve">could edit or delete a producer from the page which is absolutely not allowed. </w:t>
       </w:r>
       <w:r>
+        <w:rPr>
+          <w:noProof/>
+        </w:rPr>
         <w:drawing>
           <wp:inline distT="0" distB="0" distL="0" distR="0" wp14:anchorId="166B5DA8" wp14:editId="10F458B6">
             <wp:extent cx="5943600" cy="2948305"/>
@@ -603,6 +566,9 @@
     </w:p>
     <w:p>
       <w:r>
+        <w:rPr>
+          <w:noProof/>
+        </w:rPr>
         <w:drawing>
           <wp:inline distT="0" distB="0" distL="0" distR="0" wp14:anchorId="1CD3E085" wp14:editId="166BBDDC">
             <wp:extent cx="5943600" cy="2766695"/>
@@ -686,15 +652,7 @@
         </w:numPr>
       </w:pPr>
       <w:r>
-        <w:t xml:space="preserve">When a user uses filters in the shop, and adding a product to the cart while the page is filtered, the page refreshes and the filtering is removed so the user is back to the initial page. The user should still see the filtered products they had even if they add to cart. </w:t>
-      </w:r>
-      <w:proofErr w:type="gramStart"/>
-      <w:r>
-        <w:t>So</w:t>
-      </w:r>
-      <w:proofErr w:type="gramEnd"/>
-      <w:r>
-        <w:t xml:space="preserve"> I fixed the filtering method in the controller.</w:t>
+        <w:t>When a user uses filters in the shop, and adding a product to the cart while the page is filtered, the page refreshes and the filtering is removed so the user is back to the initial page. The user should still see the filtered products they had even if they add to cart. So I fixed the filtering method in the controller.</w:t>
       </w:r>
     </w:p>
     <w:p/>
@@ -748,15 +706,7 @@
         </w:numPr>
       </w:pPr>
       <w:r>
-        <w:t xml:space="preserve">Search function isn’t great, the user must be accurate in spelling to receive the results they want, it is not very user friendly. </w:t>
-      </w:r>
-      <w:proofErr w:type="gramStart"/>
-      <w:r>
-        <w:t>Also</w:t>
-      </w:r>
-      <w:proofErr w:type="gramEnd"/>
-      <w:r>
-        <w:t xml:space="preserve"> when searching the filters are automatically removed if applied, which isn’t great either. </w:t>
+        <w:t xml:space="preserve">Search function isn’t great, the user must be accurate in spelling to receive the results they want, it is not very user friendly. Also when searching the filters are automatically removed if applied, which isn’t great either. </w:t>
       </w:r>
     </w:p>
     <w:p>
@@ -769,6 +719,9 @@
         <w:pStyle w:val="ListParagraph"/>
       </w:pPr>
       <w:r>
+        <w:rPr>
+          <w:noProof/>
+        </w:rPr>
         <w:drawing>
           <wp:inline distT="0" distB="0" distL="0" distR="0" wp14:anchorId="7CFA2AE0" wp14:editId="63F8716D">
             <wp:extent cx="3032530" cy="1152525"/>
@@ -823,6 +776,210 @@
         <w:t>Having more then 12 products in one page is a lot and could cause slower loading speed for the page, therefore pagination must be implemented.</w:t>
       </w:r>
     </w:p>
+    <w:p/>
+    <w:p/>
+    <w:p>
+      <w:pPr>
+        <w:pStyle w:val="ListParagraph"/>
+        <w:numPr>
+          <w:ilvl w:val="0"/>
+          <w:numId w:val="13"/>
+        </w:numPr>
+        <w:rPr>
+          <w:color w:val="EE0000"/>
+        </w:rPr>
+      </w:pPr>
+      <w:r>
+        <w:rPr>
+          <w:color w:val="EE0000"/>
+        </w:rPr>
+        <w:t>Admins and developers can’t add products to the shop for producers. Which should be allowed.</w:t>
+      </w:r>
+      <w:r>
+        <w:rPr>
+          <w:color w:val="EE0000"/>
+        </w:rPr>
+        <w:br/>
+      </w:r>
+      <w:r>
+        <w:rPr>
+          <w:color w:val="EE0000"/>
+        </w:rPr>
+        <w:br/>
+      </w:r>
+      <w:r>
+        <w:rPr>
+          <w:color w:val="EE0000"/>
+        </w:rPr>
+        <w:lastRenderedPageBreak/>
+        <w:br/>
+      </w:r>
+    </w:p>
+    <w:p>
+      <w:pPr>
+        <w:pStyle w:val="ListParagraph"/>
+        <w:numPr>
+          <w:ilvl w:val="0"/>
+          <w:numId w:val="13"/>
+        </w:numPr>
+      </w:pPr>
+      <w:r>
+        <w:t>When the user accesses the orders, my loyalty, or address book page, an active styling is applied to the profile page as well which is an error, but when viewing two factor authentication or personal data page it doesn’t appear:</w:t>
+      </w:r>
+    </w:p>
+    <w:p>
+      <w:pPr>
+        <w:ind w:left="360"/>
+      </w:pPr>
+      <w:r>
+        <w:drawing>
+          <wp:inline distT="0" distB="0" distL="0" distR="0" wp14:anchorId="2AF1C1DB" wp14:editId="5C8BB385">
+            <wp:extent cx="2977816" cy="1028700"/>
+            <wp:effectExtent l="0" t="0" r="0" b="0"/>
+            <wp:docPr id="1067634971" name="Picture 1"/>
+            <wp:cNvGraphicFramePr>
+              <a:graphicFrameLocks xmlns:a="http://schemas.openxmlformats.org/drawingml/2006/main" noChangeAspect="1"/>
+            </wp:cNvGraphicFramePr>
+            <a:graphic xmlns:a="http://schemas.openxmlformats.org/drawingml/2006/main">
+              <a:graphicData uri="http://schemas.openxmlformats.org/drawingml/2006/picture">
+                <pic:pic xmlns:pic="http://schemas.openxmlformats.org/drawingml/2006/picture">
+                  <pic:nvPicPr>
+                    <pic:cNvPr id="1067634971" name=""/>
+                    <pic:cNvPicPr/>
+                  </pic:nvPicPr>
+                  <pic:blipFill rotWithShape="1">
+                    <a:blip r:embed="rId10"/>
+                    <a:srcRect l="23387" r="951" b="50804"/>
+                    <a:stretch>
+                      <a:fillRect/>
+                    </a:stretch>
+                  </pic:blipFill>
+                  <pic:spPr bwMode="auto">
+                    <a:xfrm>
+                      <a:off x="0" y="0"/>
+                      <a:ext cx="2987378" cy="1032003"/>
+                    </a:xfrm>
+                    <a:prstGeom prst="rect">
+                      <a:avLst/>
+                    </a:prstGeom>
+                    <a:ln>
+                      <a:noFill/>
+                    </a:ln>
+                    <a:extLst>
+                      <a:ext uri="{53640926-AAD7-44D8-BBD7-CCE9431645EC}">
+                        <a14:shadowObscured xmlns:a14="http://schemas.microsoft.com/office/drawing/2010/main"/>
+                      </a:ext>
+                    </a:extLst>
+                  </pic:spPr>
+                </pic:pic>
+              </a:graphicData>
+            </a:graphic>
+          </wp:inline>
+        </w:drawing>
+      </w:r>
+      <w:r>
+        <w:drawing>
+          <wp:inline distT="0" distB="0" distL="0" distR="0" wp14:anchorId="1255730F" wp14:editId="68D1A79E">
+            <wp:extent cx="2552700" cy="1100047"/>
+            <wp:effectExtent l="0" t="0" r="0" b="5080"/>
+            <wp:docPr id="1913468652" name="Picture 1"/>
+            <wp:cNvGraphicFramePr>
+              <a:graphicFrameLocks xmlns:a="http://schemas.openxmlformats.org/drawingml/2006/main" noChangeAspect="1"/>
+            </wp:cNvGraphicFramePr>
+            <a:graphic xmlns:a="http://schemas.openxmlformats.org/drawingml/2006/main">
+              <a:graphicData uri="http://schemas.openxmlformats.org/drawingml/2006/picture">
+                <pic:pic xmlns:pic="http://schemas.openxmlformats.org/drawingml/2006/picture">
+                  <pic:nvPicPr>
+                    <pic:cNvPr id="1913468652" name=""/>
+                    <pic:cNvPicPr/>
+                  </pic:nvPicPr>
+                  <pic:blipFill rotWithShape="1">
+                    <a:blip r:embed="rId11"/>
+                    <a:srcRect l="18300" t="2702" r="16826" b="44669"/>
+                    <a:stretch>
+                      <a:fillRect/>
+                    </a:stretch>
+                  </pic:blipFill>
+                  <pic:spPr bwMode="auto">
+                    <a:xfrm>
+                      <a:off x="0" y="0"/>
+                      <a:ext cx="2584642" cy="1113812"/>
+                    </a:xfrm>
+                    <a:prstGeom prst="rect">
+                      <a:avLst/>
+                    </a:prstGeom>
+                    <a:ln>
+                      <a:noFill/>
+                    </a:ln>
+                    <a:extLst>
+                      <a:ext uri="{53640926-AAD7-44D8-BBD7-CCE9431645EC}">
+                        <a14:shadowObscured xmlns:a14="http://schemas.microsoft.com/office/drawing/2010/main"/>
+                      </a:ext>
+                    </a:extLst>
+                  </pic:spPr>
+                </pic:pic>
+              </a:graphicData>
+            </a:graphic>
+          </wp:inline>
+        </w:drawing>
+      </w:r>
+    </w:p>
+    <w:p>
+      <w:pPr>
+        <w:ind w:left="360"/>
+      </w:pPr>
+    </w:p>
+    <w:p>
+      <w:pPr>
+        <w:ind w:left="360"/>
+      </w:pPr>
+      <w:r>
+        <w:t>So I deleted this line:</w:t>
+      </w:r>
+      <w:r>
+        <w:br/>
+      </w:r>
+      <w:r>
+        <w:br/>
+      </w:r>
+      <w:r>
+        <w:drawing>
+          <wp:inline distT="0" distB="0" distL="0" distR="0" wp14:anchorId="32D70FB2" wp14:editId="22B6B353">
+            <wp:extent cx="5943600" cy="3139440"/>
+            <wp:effectExtent l="0" t="0" r="0" b="3810"/>
+            <wp:docPr id="1289774586" name="Picture 1"/>
+            <wp:cNvGraphicFramePr>
+              <a:graphicFrameLocks xmlns:a="http://schemas.openxmlformats.org/drawingml/2006/main" noChangeAspect="1"/>
+            </wp:cNvGraphicFramePr>
+            <a:graphic xmlns:a="http://schemas.openxmlformats.org/drawingml/2006/main">
+              <a:graphicData uri="http://schemas.openxmlformats.org/drawingml/2006/picture">
+                <pic:pic xmlns:pic="http://schemas.openxmlformats.org/drawingml/2006/picture">
+                  <pic:nvPicPr>
+                    <pic:cNvPr id="1289774586" name=""/>
+                    <pic:cNvPicPr/>
+                  </pic:nvPicPr>
+                  <pic:blipFill>
+                    <a:blip r:embed="rId12"/>
+                    <a:stretch>
+                      <a:fillRect/>
+                    </a:stretch>
+                  </pic:blipFill>
+                  <pic:spPr>
+                    <a:xfrm>
+                      <a:off x="0" y="0"/>
+                      <a:ext cx="5943600" cy="3139440"/>
+                    </a:xfrm>
+                    <a:prstGeom prst="rect">
+                      <a:avLst/>
+                    </a:prstGeom>
+                  </pic:spPr>
+                </pic:pic>
+              </a:graphicData>
+            </a:graphic>
+          </wp:inline>
+        </w:drawing>
+      </w:r>
+    </w:p>
     <w:sectPr>
       <w:pgSz w:w="12240" w:h="15840"/>
       <w:pgMar w:top="1440" w:right="1440" w:bottom="1440" w:left="1440" w:header="720" w:footer="720" w:gutter="0"/>
@@ -834,7 +991,7 @@
 </file>
 
 <file path=word/numbering.xml><?xml version="1.0" encoding="utf-8"?>
-<w:numbering xmlns:wpc="http://schemas.microsoft.com/office/word/2010/wordprocessingCanvas" xmlns:cx="http://schemas.microsoft.com/office/drawing/2014/chartex" xmlns:cx1="http://schemas.microsoft.com/office/drawing/2015/9/8/chartex" xmlns:cx2="http://schemas.microsoft.com/office/drawing/2015/10/21/chartex" xmlns:cx3="http://schemas.microsoft.com/office/drawing/2016/5/9/chartex" xmlns:cx4="http://schemas.microsoft.com/office/drawing/2016/5/10/chartex" xmlns:cx5="http://schemas.microsoft.com/office/drawing/2016/5/11/chartex" xmlns:cx6="http://schemas.microsoft.com/office/drawing/2016/5/12/chartex" xmlns:cx7="http://schemas.microsoft.com/office/drawing/2016/5/13/chartex" xmlns:cx8="http://schemas.microsoft.com/office/drawing/2016/5/14/chartex" xmlns:mc="http://schemas.openxmlformats.org/markup-compatibility/2006" xmlns:aink="http://schemas.microsoft.com/office/drawing/2016/ink" xmlns:am3d="http://schemas.microsoft.com/office/drawing/2017/model3d" xmlns:o="urn:schemas-microsoft-com:office:office" xmlns:r="http://schemas.openxmlformats.org/officeDocument/2006/relationships" xmlns:m="http://schemas.openxmlformats.org/officeDocument/2006/math" xmlns:v="urn:schemas-microsoft-com:vml" xmlns:wp14="http://schemas.microsoft.com/office/word/2010/wordprocessingDrawing" xmlns:wp="http://schemas.openxmlformats.org/drawingml/2006/wordprocessingDrawing" xmlns:w10="urn:schemas-microsoft-com:office:word" xmlns:w="http://schemas.openxmlformats.org/wordprocessingml/2006/main" xmlns:w14="http://schemas.microsoft.com/office/word/2010/wordml" xmlns:w15="http://schemas.microsoft.com/office/word/2012/wordml" xmlns:w16cex="http://schemas.microsoft.com/office/word/2018/wordml/cex" xmlns:w16cid="http://schemas.microsoft.com/office/word/2016/wordml/cid" xmlns:w16="http://schemas.microsoft.com/office/word/2018/wordml" xmlns:w16sdtdh="http://schemas.microsoft.com/office/word/2020/wordml/sdtdatahash" xmlns:w16se="http://schemas.microsoft.com/office/word/2015/wordml/symex" xmlns:wpg="http://schemas.microsoft.com/office/word/2010/wordprocessingGroup" xmlns:wpi="http://schemas.microsoft.com/office/word/2010/wordprocessingInk" xmlns:wne="http://schemas.microsoft.com/office/word/2006/wordml" xmlns:wps="http://schemas.microsoft.com/office/word/2010/wordprocessingShape" mc:Ignorable="w14 w15 w16se w16cid w16 w16cex w16sdtdh wp14">
+<w:numbering xmlns:wpc="http://schemas.microsoft.com/office/word/2010/wordprocessingCanvas" xmlns:cx="http://schemas.microsoft.com/office/drawing/2014/chartex" xmlns:cx1="http://schemas.microsoft.com/office/drawing/2015/9/8/chartex" xmlns:cx2="http://schemas.microsoft.com/office/drawing/2015/10/21/chartex" xmlns:cx3="http://schemas.microsoft.com/office/drawing/2016/5/9/chartex" xmlns:cx4="http://schemas.microsoft.com/office/drawing/2016/5/10/chartex" xmlns:cx5="http://schemas.microsoft.com/office/drawing/2016/5/11/chartex" xmlns:cx6="http://schemas.microsoft.com/office/drawing/2016/5/12/chartex" xmlns:cx7="http://schemas.microsoft.com/office/drawing/2016/5/13/chartex" xmlns:cx8="http://schemas.microsoft.com/office/drawing/2016/5/14/chartex" xmlns:mc="http://schemas.openxmlformats.org/markup-compatibility/2006" xmlns:aink="http://schemas.microsoft.com/office/drawing/2016/ink" xmlns:am3d="http://schemas.microsoft.com/office/drawing/2017/model3d" xmlns:o="urn:schemas-microsoft-com:office:office" xmlns:oel="http://schemas.microsoft.com/office/2019/extlst" xmlns:r="http://schemas.openxmlformats.org/officeDocument/2006/relationships" xmlns:m="http://schemas.openxmlformats.org/officeDocument/2006/math" xmlns:v="urn:schemas-microsoft-com:vml" xmlns:wp14="http://schemas.microsoft.com/office/word/2010/wordprocessingDrawing" xmlns:wp="http://schemas.openxmlformats.org/drawingml/2006/wordprocessingDrawing" xmlns:w10="urn:schemas-microsoft-com:office:word" xmlns:w="http://schemas.openxmlformats.org/wordprocessingml/2006/main" xmlns:w14="http://schemas.microsoft.com/office/word/2010/wordml" xmlns:w15="http://schemas.microsoft.com/office/word/2012/wordml" xmlns:w16cex="http://schemas.microsoft.com/office/word/2018/wordml/cex" xmlns:w16cid="http://schemas.microsoft.com/office/word/2016/wordml/cid" xmlns:w16="http://schemas.microsoft.com/office/word/2018/wordml" xmlns:w16du="http://schemas.microsoft.com/office/word/2023/wordml/word16du" xmlns:w16sdtdh="http://schemas.microsoft.com/office/word/2020/wordml/sdtdatahash" xmlns:w16sdtfl="http://schemas.microsoft.com/office/word/2024/wordml/sdtformatlock" xmlns:w16se="http://schemas.microsoft.com/office/word/2015/wordml/symex" xmlns:wpg="http://schemas.microsoft.com/office/word/2010/wordprocessingGroup" xmlns:wpi="http://schemas.microsoft.com/office/word/2010/wordprocessingInk" xmlns:wne="http://schemas.microsoft.com/office/word/2006/wordml" xmlns:wps="http://schemas.microsoft.com/office/word/2010/wordprocessingShape" mc:Ignorable="w14 w15 w16se w16cid w16 w16cex w16sdtdh w16sdtfl w16du wp14">
   <w:abstractNum w:abstractNumId="0" w15:restartNumberingAfterBreak="0">
     <w:nsid w:val="090C008E"/>
     <w:multiLevelType w:val="hybridMultilevel"/>
@@ -1064,7 +1221,7 @@
   <w:abstractNum w:abstractNumId="2" w15:restartNumberingAfterBreak="0">
     <w:nsid w:val="27575D22"/>
     <w:multiLevelType w:val="hybridMultilevel"/>
-    <w:tmpl w:val="A920B54E"/>
+    <w:tmpl w:val="CDE435BE"/>
     <w:lvl w:ilvl="0" w:tplc="08090001">
       <w:start w:val="1"/>
       <w:numFmt w:val="bullet"/>
@@ -2304,50 +2461,50 @@
       </w:rPr>
     </w:lvl>
   </w:abstractNum>
-  <w:num w:numId="1">
+  <w:num w:numId="1" w16cid:durableId="186988341">
     <w:abstractNumId w:val="6"/>
   </w:num>
-  <w:num w:numId="2">
+  <w:num w:numId="2" w16cid:durableId="67652256">
     <w:abstractNumId w:val="5"/>
   </w:num>
-  <w:num w:numId="3">
+  <w:num w:numId="3" w16cid:durableId="929967752">
     <w:abstractNumId w:val="8"/>
   </w:num>
-  <w:num w:numId="4">
+  <w:num w:numId="4" w16cid:durableId="175923554">
     <w:abstractNumId w:val="9"/>
   </w:num>
-  <w:num w:numId="5">
+  <w:num w:numId="5" w16cid:durableId="49306810">
     <w:abstractNumId w:val="10"/>
   </w:num>
-  <w:num w:numId="6">
+  <w:num w:numId="6" w16cid:durableId="573584928">
     <w:abstractNumId w:val="12"/>
   </w:num>
-  <w:num w:numId="7">
+  <w:num w:numId="7" w16cid:durableId="119081201">
     <w:abstractNumId w:val="1"/>
   </w:num>
-  <w:num w:numId="8">
+  <w:num w:numId="8" w16cid:durableId="996572486">
     <w:abstractNumId w:val="3"/>
   </w:num>
-  <w:num w:numId="9">
+  <w:num w:numId="9" w16cid:durableId="824124708">
     <w:abstractNumId w:val="4"/>
   </w:num>
-  <w:num w:numId="10">
+  <w:num w:numId="10" w16cid:durableId="1418399005">
     <w:abstractNumId w:val="0"/>
   </w:num>
-  <w:num w:numId="11">
+  <w:num w:numId="11" w16cid:durableId="320305947">
     <w:abstractNumId w:val="7"/>
   </w:num>
-  <w:num w:numId="12">
+  <w:num w:numId="12" w16cid:durableId="820345608">
     <w:abstractNumId w:val="11"/>
   </w:num>
-  <w:num w:numId="13">
+  <w:num w:numId="13" w16cid:durableId="1828207229">
     <w:abstractNumId w:val="2"/>
   </w:num>
 </w:numbering>
 </file>
 
 <file path=word/styles.xml><?xml version="1.0" encoding="utf-8"?>
-<w:styles xmlns:mc="http://schemas.openxmlformats.org/markup-compatibility/2006" xmlns:r="http://schemas.openxmlformats.org/officeDocument/2006/relationships" xmlns:w="http://schemas.openxmlformats.org/wordprocessingml/2006/main" xmlns:w14="http://schemas.microsoft.com/office/word/2010/wordml" xmlns:w15="http://schemas.microsoft.com/office/word/2012/wordml" xmlns:w16cex="http://schemas.microsoft.com/office/word/2018/wordml/cex" xmlns:w16cid="http://schemas.microsoft.com/office/word/2016/wordml/cid" xmlns:w16="http://schemas.microsoft.com/office/word/2018/wordml" xmlns:w16sdtdh="http://schemas.microsoft.com/office/word/2020/wordml/sdtdatahash" xmlns:w16se="http://schemas.microsoft.com/office/word/2015/wordml/symex" mc:Ignorable="w14 w15 w16se w16cid w16 w16cex w16sdtdh">
+<w:styles xmlns:mc="http://schemas.openxmlformats.org/markup-compatibility/2006" xmlns:r="http://schemas.openxmlformats.org/officeDocument/2006/relationships" xmlns:w="http://schemas.openxmlformats.org/wordprocessingml/2006/main" xmlns:w14="http://schemas.microsoft.com/office/word/2010/wordml" xmlns:w15="http://schemas.microsoft.com/office/word/2012/wordml" xmlns:w16cex="http://schemas.microsoft.com/office/word/2018/wordml/cex" xmlns:w16cid="http://schemas.microsoft.com/office/word/2016/wordml/cid" xmlns:w16="http://schemas.microsoft.com/office/word/2018/wordml" xmlns:w16du="http://schemas.microsoft.com/office/word/2023/wordml/word16du" xmlns:w16sdtdh="http://schemas.microsoft.com/office/word/2020/wordml/sdtdatahash" xmlns:w16sdtfl="http://schemas.microsoft.com/office/word/2024/wordml/sdtformatlock" xmlns:w16se="http://schemas.microsoft.com/office/word/2015/wordml/symex" mc:Ignorable="w14 w15 w16se w16cid w16 w16cex w16sdtdh w16sdtfl w16du">
   <w:docDefaults>
     <w:rPrDefault>
       <w:rPr>

</xml_diff>

<commit_message>
Day 6 Exam Finished
21 April 13:30
</commit_message>
<xml_diff>
--- a/Task 2/Task 2 Development Template.docx
+++ b/Task 2/Task 2 Development Template.docx
@@ -1277,6 +1277,9 @@
         </mc:AlternateContent>
       </w:r>
       <w:r>
+        <w:rPr>
+          <w:noProof/>
+        </w:rPr>
         <w:drawing>
           <wp:inline distT="0" distB="0" distL="0" distR="0" wp14:anchorId="5683048E" wp14:editId="43D3230B">
             <wp:extent cx="3090265" cy="3305175"/>
@@ -1314,6 +1317,9 @@
         </w:drawing>
       </w:r>
       <w:r>
+        <w:rPr>
+          <w:noProof/>
+        </w:rPr>
         <w:drawing>
           <wp:inline distT="0" distB="0" distL="0" distR="0" wp14:anchorId="2E70A5F1" wp14:editId="3A4A4B18">
             <wp:extent cx="2841795" cy="2249738"/>
@@ -1358,6 +1364,9 @@
         </w:drawing>
       </w:r>
       <w:r>
+        <w:rPr>
+          <w:noProof/>
+        </w:rPr>
         <w:drawing>
           <wp:inline distT="0" distB="0" distL="0" distR="0" wp14:anchorId="376A5BCB" wp14:editId="06505689">
             <wp:extent cx="2579509" cy="389614"/>
@@ -1410,6 +1419,9 @@
     <w:p/>
     <w:p>
       <w:r>
+        <w:rPr>
+          <w:noProof/>
+        </w:rPr>
         <w:drawing>
           <wp:inline distT="0" distB="0" distL="0" distR="0" wp14:anchorId="1EF5271A" wp14:editId="51C412CD">
             <wp:extent cx="2130701" cy="231913"/>
@@ -1538,6 +1550,9 @@
     <w:p/>
     <w:p>
       <w:r>
+        <w:rPr>
+          <w:noProof/>
+        </w:rPr>
         <w:drawing>
           <wp:inline distT="0" distB="0" distL="0" distR="0" wp14:anchorId="7E70D5D3" wp14:editId="22C405A8">
             <wp:extent cx="5943600" cy="3343910"/>
@@ -1585,12 +1600,24 @@
       </w:r>
       <w:proofErr w:type="spellEnd"/>
       <w:r>
-        <w:t>.</w:t>
-      </w:r>
-    </w:p>
-    <w:p/>
-    <w:p>
-      <w:r>
+        <w:t xml:space="preserve">, and that all controllers have the </w:t>
+      </w:r>
+      <w:proofErr w:type="spellStart"/>
+      <w:r>
+        <w:t>ApplicationDbContext</w:t>
+      </w:r>
+      <w:proofErr w:type="spellEnd"/>
+      <w:r>
+        <w:t xml:space="preserve"> linked to it.</w:t>
+      </w:r>
+    </w:p>
+    <w:p/>
+    <w:p>
+      <w:r>
+        <w:rPr>
+          <w:noProof/>
+        </w:rPr>
+        <w:lastRenderedPageBreak/>
         <w:drawing>
           <wp:inline distT="0" distB="0" distL="0" distR="0" wp14:anchorId="7045016C" wp14:editId="67368CE3">
             <wp:extent cx="1676582" cy="190831"/>
@@ -1631,6 +1658,9 @@
     <w:p/>
     <w:p>
       <w:r>
+        <w:rPr>
+          <w:noProof/>
+        </w:rPr>
         <w:drawing>
           <wp:inline distT="0" distB="0" distL="0" distR="0" wp14:anchorId="430A55F6" wp14:editId="7E90A7B6">
             <wp:extent cx="1305107" cy="228632"/>

</xml_diff>